<commit_message>
scorecard backfill: 50 first calls, 3 reversals, 15 closed positions
</commit_message>
<xml_diff>
--- a/reports/scorecards/AFG_Scorecard_2026-10-07.docx
+++ b/reports/scorecards/AFG_Scorecard_2026-10-07.docx
@@ -174,7 +174,7 @@
                 <w:color w:val="17365D"/>
                 <w:sz w:val="52"/>
               </w:rPr>
-              <w:t>8-3</w:t>
+              <w:t>9-3</w:t>
             </w:r>
           </w:p>
           <w:p>
@@ -190,7 +190,7 @@
                 <w:color w:val="17365D"/>
                 <w:sz w:val="22"/>
               </w:rPr>
-              <w:t>73% accuracy</w:t>
+              <w:t>75% accuracy</w:t>
             </w:r>
           </w:p>
           <w:p>
@@ -206,7 +206,7 @@
                 <w:color w:val="808080"/>
                 <w:sz w:val="19"/>
               </w:rPr>
-              <w:t>AFG Brier 0.188</w:t>
+              <w:t>AFG Brier 0.187</w:t>
             </w:r>
           </w:p>
           <w:p>
@@ -222,7 +222,7 @@
                 <w:color w:val="1F6F3D"/>
                 <w:sz w:val="18"/>
               </w:rPr>
-              <w:t>beats market by 0.007</w:t>
+              <w:t>beats market by 0.015</w:t>
             </w:r>
           </w:p>
         </w:tc>
@@ -250,7 +250,7 @@
                 <w:color w:val="17365D"/>
                 <w:sz w:val="52"/>
               </w:rPr>
-              <w:t>8-2</w:t>
+              <w:t>9-2</w:t>
             </w:r>
           </w:p>
           <w:p>
@@ -266,7 +266,7 @@
                 <w:color w:val="17365D"/>
                 <w:sz w:val="22"/>
               </w:rPr>
-              <w:t>80% accuracy</w:t>
+              <w:t>82% accuracy</w:t>
             </w:r>
           </w:p>
           <w:p>
@@ -282,7 +282,7 @@
                 <w:color w:val="808080"/>
                 <w:sz w:val="19"/>
               </w:rPr>
-              <w:t>AFG Brier 0.130</w:t>
+              <w:t>AFG Brier 0.135</w:t>
             </w:r>
           </w:p>
           <w:p>
@@ -298,7 +298,7 @@
                 <w:color w:val="1F6F3D"/>
                 <w:sz w:val="18"/>
               </w:rPr>
-              <w:t>beats market by 0.025</w:t>
+              <w:t>beats market by 0.032</w:t>
             </w:r>
           </w:p>
         </w:tc>
@@ -1048,7 +1048,7 @@
                 <w:color w:val="808080"/>
                 <w:sz w:val="19"/>
               </w:rPr>
-              <w:t>5</w:t>
+              <w:t>6</w:t>
             </w:r>
           </w:p>
         </w:tc>
@@ -1075,7 +1075,7 @@
                 <w:color w:val="1F6F3D"/>
                 <w:sz w:val="19"/>
               </w:rPr>
-              <w:t>4</w:t>
+              <w:t>5</w:t>
             </w:r>
           </w:p>
         </w:tc>
@@ -1129,7 +1129,7 @@
                 <w:color w:val="17365D"/>
                 <w:sz w:val="19"/>
               </w:rPr>
-              <w:t>80%</w:t>
+              <w:t>83%</w:t>
             </w:r>
           </w:p>
         </w:tc>
@@ -1156,7 +1156,7 @@
                 <w:color w:val="17365D"/>
                 <w:sz w:val="19"/>
               </w:rPr>
-              <w:t>0.187</w:t>
+              <w:t>0.186</w:t>
             </w:r>
           </w:p>
         </w:tc>
@@ -2043,7 +2043,198 @@
                 <w:color w:val="17365D"/>
                 <w:sz w:val="18"/>
               </w:rPr>
-              <w:t>16%</w:t>
+              <w:t>15%</w:t>
+            </w:r>
+          </w:p>
+        </w:tc>
+        <w:tc>
+          <w:tcPr>
+            <w:tcBorders>
+              <w:top w:val="single" w:sz="2" w:color="B0B8C8"/>
+              <w:left w:val="single" w:sz="2" w:color="B0B8C8"/>
+              <w:bottom w:val="single" w:sz="2" w:color="B0B8C8"/>
+              <w:right w:val="single" w:sz="2" w:color="B0B8C8"/>
+            </w:tcBorders>
+            <w:tcW w:w="1300" w:type="dxa"/>
+          </w:tcPr>
+          <w:p>
+            <w:pPr>
+              <w:spacing w:before="60" w:after="60"/>
+            </w:pPr>
+            <w:r/>
+            <w:r>
+              <w:rPr>
+                <w:rFonts w:ascii="Cambria" w:hAnsi="Cambria"/>
+                <w:b/>
+                <w:i w:val="0"/>
+                <w:color w:val="A6231F"/>
+                <w:sz w:val="18"/>
+              </w:rPr>
+              <w:t>BUY NO</w:t>
+            </w:r>
+          </w:p>
+        </w:tc>
+        <w:tc>
+          <w:tcPr>
+            <w:tcBorders>
+              <w:top w:val="single" w:sz="2" w:color="B0B8C8"/>
+              <w:left w:val="single" w:sz="2" w:color="B0B8C8"/>
+              <w:bottom w:val="single" w:sz="2" w:color="B0B8C8"/>
+              <w:right w:val="single" w:sz="2" w:color="B0B8C8"/>
+            </w:tcBorders>
+            <w:tcW w:w="1000" w:type="dxa"/>
+          </w:tcPr>
+          <w:p>
+            <w:pPr>
+              <w:spacing w:before="60" w:after="60"/>
+            </w:pPr>
+            <w:r/>
+            <w:r>
+              <w:rPr>
+                <w:rFonts w:ascii="Cambria" w:hAnsi="Cambria"/>
+                <w:b w:val="0"/>
+                <w:i w:val="0"/>
+                <w:color w:val="808080"/>
+                <w:sz w:val="18"/>
+              </w:rPr>
+              <w:t>NO</w:t>
+            </w:r>
+          </w:p>
+        </w:tc>
+        <w:tc>
+          <w:tcPr>
+            <w:tcBorders>
+              <w:top w:val="single" w:sz="2" w:color="B0B8C8"/>
+              <w:left w:val="single" w:sz="2" w:color="B0B8C8"/>
+              <w:bottom w:val="single" w:sz="2" w:color="B0B8C8"/>
+              <w:right w:val="single" w:sz="2" w:color="B0B8C8"/>
+            </w:tcBorders>
+            <w:tcW w:w="2100" w:type="dxa"/>
+          </w:tcPr>
+          <w:p>
+            <w:pPr>
+              <w:spacing w:before="60" w:after="60"/>
+            </w:pPr>
+            <w:r/>
+            <w:r>
+              <w:rPr>
+                <w:rFonts w:ascii="Cambria" w:hAnsi="Cambria"/>
+                <w:b/>
+                <w:i w:val="0"/>
+                <w:color w:val="1F6F3D"/>
+                <w:sz w:val="18"/>
+              </w:rPr>
+              <w:t>✓ Correct</w:t>
+            </w:r>
+          </w:p>
+        </w:tc>
+      </w:tr>
+      <w:tr>
+        <w:tc>
+          <w:tcPr>
+            <w:tcBorders>
+              <w:top w:val="single" w:sz="2" w:color="B0B8C8"/>
+              <w:left w:val="single" w:sz="2" w:color="B0B8C8"/>
+              <w:bottom w:val="single" w:sz="2" w:color="B0B8C8"/>
+              <w:right w:val="single" w:sz="2" w:color="B0B8C8"/>
+            </w:tcBorders>
+            <w:tcW w:w="3500" w:type="dxa"/>
+          </w:tcPr>
+          <w:p>
+            <w:pPr>
+              <w:spacing w:before="60" w:after="60"/>
+            </w:pPr>
+            <w:r/>
+            <w:r>
+              <w:rPr>
+                <w:rFonts w:ascii="Cambria" w:hAnsi="Cambria"/>
+                <w:b w:val="0"/>
+                <w:i w:val="0"/>
+                <w:color w:val="17365D"/>
+                <w:sz w:val="18"/>
+              </w:rPr>
+              <w:t>Spider-Man Brand New Day — RT score above 91</w:t>
+            </w:r>
+          </w:p>
+        </w:tc>
+        <w:tc>
+          <w:tcPr>
+            <w:tcBorders>
+              <w:top w:val="single" w:sz="2" w:color="B0B8C8"/>
+              <w:left w:val="single" w:sz="2" w:color="B0B8C8"/>
+              <w:bottom w:val="single" w:sz="2" w:color="B0B8C8"/>
+              <w:right w:val="single" w:sz="2" w:color="B0B8C8"/>
+            </w:tcBorders>
+            <w:tcW w:w="1300" w:type="dxa"/>
+          </w:tcPr>
+          <w:p>
+            <w:pPr>
+              <w:spacing w:before="60" w:after="60"/>
+            </w:pPr>
+            <w:r/>
+            <w:r>
+              <w:rPr>
+                <w:rFonts w:ascii="Cambria" w:hAnsi="Cambria"/>
+                <w:b w:val="0"/>
+                <w:i w:val="0"/>
+                <w:color w:val="808080"/>
+                <w:sz w:val="18"/>
+              </w:rPr>
+              <w:t>Culture</w:t>
+            </w:r>
+          </w:p>
+        </w:tc>
+        <w:tc>
+          <w:tcPr>
+            <w:tcBorders>
+              <w:top w:val="single" w:sz="2" w:color="B0B8C8"/>
+              <w:left w:val="single" w:sz="2" w:color="B0B8C8"/>
+              <w:bottom w:val="single" w:sz="2" w:color="B0B8C8"/>
+              <w:right w:val="single" w:sz="2" w:color="B0B8C8"/>
+            </w:tcBorders>
+            <w:tcW w:w="800" w:type="dxa"/>
+          </w:tcPr>
+          <w:p>
+            <w:pPr>
+              <w:spacing w:before="60" w:after="60"/>
+            </w:pPr>
+            <w:r/>
+            <w:r>
+              <w:rPr>
+                <w:rFonts w:ascii="Cambria" w:hAnsi="Cambria"/>
+                <w:b w:val="0"/>
+                <w:i w:val="0"/>
+                <w:color w:val="808080"/>
+                <w:sz w:val="18"/>
+              </w:rPr>
+              <w:t>55%</w:t>
+            </w:r>
+          </w:p>
+        </w:tc>
+        <w:tc>
+          <w:tcPr>
+            <w:tcBorders>
+              <w:top w:val="single" w:sz="2" w:color="B0B8C8"/>
+              <w:left w:val="single" w:sz="2" w:color="B0B8C8"/>
+              <w:bottom w:val="single" w:sz="2" w:color="B0B8C8"/>
+              <w:right w:val="single" w:sz="2" w:color="B0B8C8"/>
+            </w:tcBorders>
+            <w:tcW w:w="800" w:type="dxa"/>
+          </w:tcPr>
+          <w:p>
+            <w:pPr>
+              <w:spacing w:before="60" w:after="60"/>
+            </w:pPr>
+            <w:r/>
+            <w:r>
+              <w:rPr>
+                <w:rFonts w:ascii="Cambria" w:hAnsi="Cambria"/>
+                <w:b w:val="0"/>
+                <w:i w:val="0"/>
+                <w:color w:val="17365D"/>
+                <w:sz w:val="18"/>
+              </w:rPr>
+              <w:t>45%</w:t>
             </w:r>
           </w:p>
         </w:tc>
@@ -2971,7 +3162,7 @@
                 <w:color w:val="808080"/>
                 <w:sz w:val="18"/>
               </w:rPr>
-              <w:t>28%</w:t>
+              <w:t>26%</w:t>
             </w:r>
           </w:p>
         </w:tc>

</xml_diff>